<commit_message>
Draft_105: spaces before (EC)/(FP-Cap) in Combined Example
</commit_message>
<xml_diff>
--- a/thesis/003_ThesisProposal_Draft_105.docx
+++ b/thesis/003_ThesisProposal_Draft_105.docx
@@ -13313,7 +13313,7 @@
           <w:szCs w:val="20"/>
           <w:color w:val="ed7d31"/>
         </w:rPr>
-        <w:t xml:space="preserve">(EC)</w:t>
+        <w:t xml:space="preserve"> (EC)</w:t>
       </w:r>
       <w:r>
         <w:rPr>
@@ -13340,7 +13340,7 @@
           <w:szCs w:val="20"/>
           <w:color w:val="ed7d31"/>
         </w:rPr>
-        <w:t xml:space="preserve">(EC)</w:t>
+        <w:t xml:space="preserve"> (EC)</w:t>
       </w:r>
       <w:r>
         <w:rPr>
@@ -13366,7 +13366,7 @@
           <w:szCs w:val="20"/>
           <w:color w:val="808080"/>
         </w:rPr>
-        <w:t xml:space="preserve">(FP-Cap)</w:t>
+        <w:t xml:space="preserve"> (FP-Cap)</w:t>
       </w:r>
       <w:r>
         <w:rPr>

</xml_diff>